<commit_message>
update Affirmation text in all documents
</commit_message>
<xml_diff>
--- a/docs/Diploma_Work_SmartLearn.docx
+++ b/docs/Diploma_Work_SmartLearn.docx
@@ -298,7 +298,7 @@
               <w:br/>
             </w:r>
             <w:r>
-              <w:t>Studen:</w:t>
+              <w:t>Student:</w:t>
             </w:r>
           </w:p>
         </w:tc>
@@ -376,7 +376,7 @@
               <w:rPr>
                 <w:lang w:val="en-US"/>
               </w:rPr>
-              <w:t>Kurbanov Azimjon</w:t>
+              <w:t>Kurbanov Azimzhon</w:t>
             </w:r>
           </w:p>
         </w:tc>
@@ -402,7 +402,7 @@
               <w:ind w:firstLine="0"/>
             </w:pPr>
             <w:r>
-              <w:t>Supervsor:</w:t>
+              <w:t>Supervisor:</w:t>
             </w:r>
           </w:p>
         </w:tc>
@@ -462,7 +462,7 @@
               <w:rPr>
                 <w:lang w:val="en-US"/>
               </w:rPr>
-              <w:t>Profesor</w:t>
+              <w:t>Professor</w:t>
             </w:r>
             <w:proofErr w:type="spellEnd"/>
             <w:r>
@@ -534,7 +534,7 @@
     </w:p>
     <w:p>
       <w:r>
-        <w:t>The research confirms the hypothesis that a domain-agnostic LMS combining RAG retrieval conditioned on student performance data with Socratic dialogue constraints delivers a more adaptive and pedagogically effective learning experience than any single existing platform. The Bachelor Paper is written in 49 pages and contains 12 tables, 10 figures, 3 listings, 2 annexes, and a list of references with 13 sources.</w:t>
+        <w:t>The research confirms the hypothesis that a domain-agnostic LMS combining RAG retrieval conditioned on student performance data with Socratic dialogue constraints delivers a more adaptive and pedagogically effective learning experience than any single existing platform. The Bachelor Paper is written in 41 pages and contains 12 tables, 10 figures, 3 listings, 2 annexes, and a list of references with 13 sources.</w:t>
       </w:r>
     </w:p>
     <w:p>
@@ -10023,7 +10023,7 @@
         <w:jc w:val="center"/>
       </w:pPr>
       <w:r>
-        <w:t>Figure 3.4 illustrates the group management screen, where administrators assign teachers, enrol students, and configure the schedule for each group. This interface maps directly to the groups and group_enrollments tables in the PostgreSQL schema described in Section2.5.</w:t>
+        <w:t>Figure 3.4 illustrates the group management screen, where administrators assign teachers, enrol students, and configure the schedule for each group. This interface maps directly to the group management structure in the PostgreSQL schema described in Section2.5.</w:t>
       </w:r>
       <w:r>
         <w:br/>
@@ -14952,7 +14952,16 @@
     </w:p>
     <w:p>
       <w:r>
-        <w:t>I hereby affirm that this Bachelor Paper has been developed independently by me and that I have not used any sources other than those listed in the References section. All citations and references have been properly acknowledged. This work has not been previously submitted for any academic degree.</w:t>
+        <w:t xml:space="preserve">Hereby I, Azimzhon Kurbanov, affirm that the Bachelor's thesis was performed independently, without the assistance of others; sources of data and definitions taken from external sources are indicated in the thesis. This work has not been submitted to any other examination commission and has not been published elsewhere.</w:t>
+      </w:r>
+    </w:p>
+    <w:p>
+      <w:pPr>
+        <w:spacing w:before="240"/>
+        <w:ind w:firstLine="0"/>
+      </w:pPr>
+      <w:r>
+        <w:t>Riga, 2026</w:t>
       </w:r>
     </w:p>
     <w:p>
@@ -14961,7 +14970,15 @@
         <w:ind w:firstLine="0"/>
       </w:pPr>
       <w:r>
-        <w:t>Student: Azimjon Kurbanov                    Date: _______________</w:t>
+        <w:t xml:space="preserve">________________________            Azimzhon Kurbanov</w:t>
+      </w:r>
+    </w:p>
+    <w:p>
+      <w:pPr>
+        <w:ind w:firstLine="0"/>
+      </w:pPr>
+      <w:r>
+        <w:t>signature</w:t>
       </w:r>
     </w:p>
     <w:sectPr>

</xml_diff>